<commit_message>
docs: fill submission repo URL and date
</commit_message>
<xml_diff>
--- a/T3N-submission.docx
+++ b/T3N-submission.docx
@@ -56,7 +56,7 @@
           <w:rPr>
             <w:rStyle w:val="Hyperlink"/>
           </w:rPr>
-          <w:t xml:space="preserve">REPLACE WITH YOUR PUBLIC REPO URL</w:t>
+          <w:t xml:space="preserve">https://github.com/gikenye/t3n-governance-agents</w:t>
         </w:r>
       </w:hyperlink>
     </w:p>
@@ -73,7 +73,7 @@
           <w:iCs/>
           <w:color w:val="B00000"/>
         </w:rPr>
-        <w:t xml:space="preserve">[ date ]</w:t>
+        <w:t xml:space="preserve">August 28, 2026</w:t>
       </w:r>
     </w:p>
     <w:p>

</xml_diff>